<commit_message>
Android: focus Death May Die on the active investigator and track skills
</commit_message>
<xml_diff>
--- a/Documentation/User Manual/TurnHub App Manual V0.21.docx
+++ b/Documentation/User Manual/TurnHub App Manual V0.21.docx
@@ -644,6 +644,69 @@
       </ns0:r>
       <ns0:r>
         <ns0:t>, in setup and in the table menu, summarizes the mode and links to its official rules.</ns0:t>
+      </ns0:r>
+    </ns0:p>
+    <ns0:p>
+      <ns0:pPr>
+        <ns0:pStyle ns0:val="Heading2"/>
+      </ns0:pPr>
+      <ns0:r>
+        <ns0:t>Death May Die</ns0:t>
+      </ns0:r>
+    </ns0:p>
+    <ns0:p>
+      <ns0:pPr>
+        <ns0:numPr>
+          <ns0:ilvl ns0:val="0"/>
+          <ns0:numId ns0:val="1"/>
+        </ns0:numPr>
+      </ns0:pPr>
+      <ns0:r>
+        <ns0:t>Cthulhu: Death May Die is a cooperative, phone-hosted game. Pick each player’s investigator in setup. Everyone wins or loses together, and wounds and stress are reminders; the physical game determines their effects.</ns0:t>
+      </ns0:r>
+    </ns0:p>
+    <ns0:p>
+      <ns0:pPr>
+        <ns0:numPr>
+          <ns0:ilvl ns0:val="0"/>
+          <ns0:numId ns0:val="1"/>
+        </ns0:numPr>
+      </ns0:pPr>
+      <ns0:r>
+        <ns0:t>The active investigator uses 70% of the play area. Their card scrolls independently, with the other players in a smaller list below. Wide screens put abilities beside the counters. Open another player’s menu to edit their counters and skills. A player still to go can choose Take the next turn; after every living player has gone, a new round begins.</ns0:t>
+      </ns0:r>
+    </ns0:p>
+    <ns0:p>
+      <ns0:pPr>
+        <ns0:numPr>
+          <ns0:ilvl ns0:val="0"/>
+          <ns0:numId ns0:val="1"/>
+        </ns0:numPr>
+      </ns0:pPr>
+      <ns0:r>
+        <ns0:t>Each investigator has three skill markers, with levels 1 to 4. Tap the level to move a marker; earlier effects still apply unless a later effect says instead. The ten core-box investigators include ability summaries. Edit abilities lets you enter or correct the names and all four level effects for any investigator. Apply effects to the physical game yourself.</ns0:t>
+      </ns0:r>
+    </ns0:p>
+    <ns0:p>
+      <ns0:pPr>
+        <ns0:numPr>
+          <ns0:ilvl ns0:val="0"/>
+          <ns0:numId ns0:val="1"/>
+        </ns0:numPr>
+      </ns0:pPr>
+      <ns0:r>
+        <ns0:t>The Insanity counter records sanity loss. It stops at each insanity threshold and shows bonus dice. Resolve your insanity card and choose a skill upgrade on the physical dashboard when prompted. The minus button corrects an entry; it does not mean sanity can normally be healed. Reaching the end of the track does not automatically end a player’s game: use their menu to resolve the outcome.</ns0:t>
+      </ns0:r>
+    </ns0:p>
+    <ns0:p>
+      <ns0:pPr>
+        <ns0:numPr>
+          <ns0:ilvl ns0:val="0"/>
+          <ns0:numId ns0:val="1"/>
+        </ns0:numPr>
+      </ns0:pPr>
+      <ns0:r>
+        <ns0:t>Skill markers, sanity loss and edited ability text survive closing the app. A rematch resets the markers and keeps the edited text. Choosing a different investigator clears their dashboard.</ns0:t>
       </ns0:r>
     </ns0:p>
     <ns0:p>

</xml_diff>

<commit_message>
Android: choose who receives a Death May Die pass
</commit_message>
<xml_diff>
--- a/Documentation/User Manual/TurnHub App Manual V0.21.docx
+++ b/Documentation/User Manual/TurnHub App Manual V0.21.docx
@@ -673,7 +673,7 @@
         </ns0:numPr>
       </ns0:pPr>
       <ns0:r>
-        <ns0:t>The active investigator uses 70% of the play area. Their card scrolls independently, with the other players in a smaller list below. Wide screens put abilities beside the counters. Open another player’s menu to edit their counters and skills. A player still to go can choose Take the next turn; after every living player has gone, a new round begins.</ns0:t>
+        <ns0:t>The active investigator uses 70% of the play area. Their card scrolls independently, with the other players in a smaller list below. Wide screens put abilities beside the counters. Open another player’s menu to edit their counters and skills. Tap Pass to open Pass to? and choose an investigator who still needs a turn. After the last turn, choose any surviving investigator to start the next round, including the current player. Cancel or Back keeps the current turn. A player still to go can also choose Take the next turn from their panel.</ns0:t>
       </ns0:r>
     </ns0:p>
     <ns0:p>
@@ -1044,6 +1044,11 @@
       </ns0:r>
       <ns0:r>
         <ns0:t>, a tap undoes the pass.</ns0:t>
+      </ns0:r>
+    </ns0:p>
+    <ns0:p>
+      <ns0:r>
+        <ns0:t>Death May Die uses the Pass to? menu described under Game Modes.</ns0:t>
       </ns0:r>
     </ns0:p>
     <ns0:p>

</xml_diff>

<commit_message>
Android: assign sanity conditions and relics to investigators
</commit_message>
<xml_diff>
--- a/Documentation/User Manual/TurnHub App Manual V0.21.docx
+++ b/Documentation/User Manual/TurnHub App Manual V0.21.docx
@@ -706,7 +706,18 @@
         </ns0:numPr>
       </ns0:pPr>
       <ns0:r>
-        <ns0:t>Skill markers, sanity loss and edited ability text survive closing the app. A rematch resets the markers and keeps the edited text. Choosing a different investigator clears their dashboard.</ns0:t>
+        <ns0:t>Each investigator has a Sanity condition and a Relic slot. In setup, use Assign sanity condition or Assign relic beneath their name. During play, use Assign or Edit on their card or in their menu. Enter a name and optional rules/notes; Save applies the assignment, Cancel keeps the current card, and Remove clears that slot. Apply card effects to the physical game. Back to setup keeps these assignments, and a rematch starts with empty slots.</ns0:t>
+      </ns0:r>
+    </ns0:p>
+    <ns0:p>
+      <ns0:pPr>
+        <ns0:numPr>
+          <ns0:ilvl ns0:val="0"/>
+          <ns0:numId ns0:val="1"/>
+        </ns0:numPr>
+      </ns0:pPr>
+      <ns0:r>
+        <ns0:t>Skill markers, sanity loss and edited ability text survive closing the app. A rematch resets the markers and clears assigned cards, while keeping edited ability text. Choosing a different investigator clears their dashboard.</ns0:t>
       </ns0:r>
     </ns0:p>
     <ns0:p>

</xml_diff>

<commit_message>
Android: require Death May Die card assignments in setup
</commit_message>
<xml_diff>
--- a/Documentation/User Manual/TurnHub App Manual V0.21.docx
+++ b/Documentation/User Manual/TurnHub App Manual V0.21.docx
@@ -706,18 +706,18 @@
         </ns0:numPr>
       </ns0:pPr>
       <ns0:r>
-        <ns0:t>Each investigator has a Sanity condition and a Relic slot. In setup, use Assign sanity condition or Assign relic beneath their name. During play, use Assign or Edit on their card or in their menu. Enter a name and optional rules/notes; Save applies the assignment, Cancel keeps the current card, and Remove clears that slot. Apply card effects to the physical game. Back to setup keeps these assignments, and a rematch starts with empty slots.</ns0:t>
-      </ns0:r>
-    </ns0:p>
-    <ns0:p>
-      <ns0:pPr>
-        <ns0:numPr>
-          <ns0:ilvl ns0:val="0"/>
-          <ns0:numId ns0:val="1"/>
-        </ns0:numPr>
-      </ns0:pPr>
-      <ns0:r>
-        <ns0:t>Skill markers, sanity loss and edited ability text survive closing the app. A rematch resets the markers and clears assigned cards, while keeping edited ability text. Choosing a different investigator clears their dashboard.</ns0:t>
+        <ns0:t>Before starting, assign a Sanity condition to every investigator using Assign sanity condition beneath their name. Relics are optional: turn on Use relics in setup when playing with them, then assign a relic to every investigator. Start stays unavailable until the required cards are assigned. Turning Use relics off clears relic assignments and hides their slots. Enter a name and optional rules/notes; Save applies the assignment, Cancel keeps the current card, and Remove clears that slot. During play, Edit on the card or in the player menu lets you correct a reference. Apply card effects to the physical game.</ns0:t>
+      </ns0:r>
+    </ns0:p>
+    <ns0:p>
+      <ns0:pPr>
+        <ns0:numPr>
+          <ns0:ilvl ns0:val="0"/>
+          <ns0:numId ns0:val="1"/>
+        </ns0:numPr>
+      </ns0:pPr>
+      <ns0:r>
+        <ns0:t>Skill markers, sanity loss, edited ability text and assigned cards survive closing the app. Back to setup keeps assignments. Set up rematch returns to setup with empty card slots and reset markers, while keeping investigators, edited ability text and the Use relics option. Assign fresh cards before starting the next game. Choosing a different investigator clears their dashboard.</ns0:t>
       </ns0:r>
     </ns0:p>
     <ns0:p>

</xml_diff>

<commit_message>
Android: add community investigator card catalogue and references
</commit_message>
<xml_diff>
--- a/Documentation/User Manual/TurnHub App Manual V0.21.docx
+++ b/Documentation/User Manual/TurnHub App Manual V0.21.docx
@@ -706,7 +706,13 @@
         </ns0:numPr>
       </ns0:pPr>
       <ns0:r>
-        <ns0:t>Before starting, assign a Sanity condition to every investigator using Assign sanity condition beneath their name. Relics are optional: turn on Use relics in setup when playing with them, then assign a relic to every investigator. Start stays unavailable until the required cards are assigned. Turning Use relics off clears relic assignments and hides their slots. Enter a name and optional rules/notes; Save applies the assignment, Cancel keeps the current card, and Remove clears that slot. During play, Edit on the card or in the player menu lets you correct a reference. Apply card effects to the physical game.</ns0:t>
+        <ns0:t>Before starting, assign a Sanity condition to every investigator using Assign sanity condition beneath their name. Relics are optional: turn on Use relics in setup when playing with them, then assign a relic to every investigator. Start stays unavailable until the required cards are assigned. Turning Use relics off clears relic assignments and hides their slots. Choose a card from the searchable community catalogue, or use a custom entry and type its name. Search also finds known transformed relic names. The catalogue covers part of the available collection; missing cards can always be entered manually. Names and optional rules/notes remain editable; Save applies the assignment, Cancel keeps the current card, and Remove clears that slot. During play, Edit on the card or in the player menu lets you correct a reference. Apply card effects to the physical game.</ns0:t>
+      </ns0:r>
+    </ns0:p>
+    <ns0:p>
+      <ns0:pPr/>
+      <ns0:r>
+        <ns0:t>View card reference opens a community photograph where available. Some images show paired cards or both relic faces. Pinch and drag, or use Zoom in, Zoom out and Fit to read it. Images download only when opened and remain cached for offline use; Retry tries an unavailable download again. A missing image never blocks assignment. Enter rules and reminders from your printed card. Renaming a catalogue card makes it a custom entry and removes its old image reference.</ns0:t>
       </ns0:r>
     </ns0:p>
     <ns0:p>

</xml_diff>

<commit_message>
Android: protect Pass misses from life changes
</commit_message>
<xml_diff>
--- a/Documentation/User Manual/TurnHub App Manual V0.21.docx
+++ b/Documentation/User Manual/TurnHub App Manual V0.21.docx
@@ -1024,8 +1024,9 @@
         </ns0:rPr>
         <ns0:t>Life:</ns0:t>
       </ns0:r>
-      <ns0:r>
-        <ns0:t xml:space="preserve"> tap the top half of a panel to add life and the bottom half to subtract; hold to repeat the bigger step. Steps are 1 and 5 (100 and 1000 for Yu-Gi-Oh!). On rotated panels, minus is always on the player's left and plus on their right.</ns0:t>
+      <ns0:r/>
+      <ns0:r>
+        <ns0:t xml:space="preserve"> use the minus and plus halves of the area above the bottom action strip; hold to repeat the bigger step. Steps are 1 and 5 (100 and 1000 for Yu-Gi-Oh!). On rotated panels, minus is always on the player's left and plus on their right. The action strip and the space above it do not change life, so a near-miss around Pass does nothing. Moving a life gesture out of its area cancels it.</ns0:t>
       </ns0:r>
     </ns0:p>
     <ns0:p>
@@ -1041,26 +1042,21 @@
         </ns0:rPr>
         <ns0:t>Pass:</ns0:t>
       </ns0:r>
-      <ns0:r>
-        <ns0:t xml:space="preserve"> the active player taps </ns0:t>
-      </ns0:r>
-      <ns0:r>
-        <ns0:rPr>
-          <ns0:b/>
-        </ns0:rPr>
-        <ns0:t>Pass</ns0:t>
-      </ns0:r>
-      <ns0:r>
-        <ns0:t xml:space="preserve">. While it says </ns0:t>
-      </ns0:r>
-      <ns0:r>
-        <ns0:rPr>
-          <ns0:b/>
-        </ns0:rPr>
-        <ns0:t>Passing… tap to keep</ns0:t>
-      </ns0:r>
-      <ns0:r>
-        <ns0:t>, a tap undoes the pass.</ns0:t>
+      <ns0:r/>
+      <ns0:r>
+        <ns0:rPr>
+          <ns0:b/>
+        </ns0:rPr>
+      </ns0:r>
+      <ns0:r/>
+      <ns0:r>
+        <ns0:rPr>
+          <ns0:b/>
+        </ns0:rPr>
+      </ns0:r>
+      <ns0:r/>
+      <ns0:r>
+        <ns0:t xml:space="preserve"> the active player holds Pass for 0.6 seconds. It has a larger target in the separate bottom action strip. Small panels show the turn clock inside Pass. While it says Passing… tap to keep, a tap undoes the pass.</ns0:t>
       </ns0:r>
     </ns0:p>
     <ns0:p>

</xml_diff>

<commit_message>
Android: add Death May Die house draws and investigator helpers
</commit_message>
<xml_diff>
--- a/Documentation/User Manual/TurnHub App Manual V0.21.docx
+++ b/Documentation/User Manual/TurnHub App Manual V0.21.docx
@@ -662,7 +662,7 @@
         </ns0:numPr>
       </ns0:pPr>
       <ns0:r>
-        <ns0:t>Cthulhu: Death May Die is a cooperative, phone-hosted game. Pick each player’s investigator in setup. Everyone wins or loses together, and wounds and stress are reminders; the physical game determines their effects.</ns0:t>
+        <ns0:t>Cthulhu: Death May Die is a cooperative, phone-hosted game. Pick each player’s investigator in setup. Everyone wins or loses together, and wounds and stress are reminders; the physical game determines their effects. Search investigators by name or known ability, or use Ability to filter common skills such as Brawling. Random investigator picks an available figure within your search and filter. Tap a name or Random to preview before choosing Use investigator. The community skill index is incomplete; missing signature effects are marked and a community guide is linked.</ns0:t>
       </ns0:r>
     </ns0:p>
     <ns0:p>
@@ -684,7 +684,7 @@
         </ns0:numPr>
       </ns0:pPr>
       <ns0:r>
-        <ns0:t>Each investigator has three skill markers, with levels 1 to 4. Tap the level to move a marker; earlier effects still apply unless a later effect says instead. Preview upgrades shows future level effects without moving a marker. The ten core-box investigators include ability summaries. Edit abilities lets you enter or correct the names and all four level effects for any investigator. Apply effects to the physical game yourself.</ns0:t>
+        <ns0:t>Each investigator starts with three skill markers, with levels 1 to 4. Tap a level to move its marker; earlier effects still apply unless a later effect says instead. Preview upgrades shows future effects without moving a marker. The ten core-box investigators include complete summaries; indexed investigators also include known common skills. Edit abilities lets you correct names and all four effects, add a common skill such as Swiftness or a custom ability, and remove added skills. Up to eight skills are supported. Added skills start at level 1; move their markers to match the granting effect. Apply all effects to the physical game.</ns0:t>
       </ns0:r>
     </ns0:p>
     <ns0:p>
@@ -706,7 +706,7 @@
         </ns0:numPr>
       </ns0:pPr>
       <ns0:r>
-        <ns0:t>Before starting, assign a Sanity condition to every investigator using Assign sanity condition beneath their name. Relics are optional: turn on Use relics in setup when playing with them, then assign a relic to every investigator. Start stays unavailable until the required cards are assigned. Turning Use relics off clears relic assignments and hides their slots. Choose a card from the searchable community catalogue, or use a custom entry and type its name. Search also finds known transformed relic names. The catalogue covers part of the available collection; missing cards can always be entered manually. Names and optional rules/notes remain editable; Save applies the assignment, Cancel keeps the current card, and Remove clears that slot. During play, Edit on the card or in the player menu lets you correct a reference. Apply card effects to the physical game.</ns0:t>
+        <ns0:t>Before starting, assign a Sanity condition to every investigator using Assign sanity condition beneath their name. Relics are optional: turn on Use relics in setup when playing with them, then assign a relic to every investigator. Start stays unavailable until the required cards are assigned. Turning Use relics off clears relic assignments and hides their slots. Choose a card from the searchable community catalogue, or use a custom entry and type its name. Search also finds known transformed relic names. The catalogue covers part of the available collection; missing cards can always be entered manually. Names and optional rules/notes remain editable; Save applies the assignment, Cancel keeps the current card, and Remove clears that slot. During play, Edit on the card or in the player menu lets you correct a reference. Apply card effects to the physical game. Draw two, pick one in setup enables your house rule for conditions and enabled relics. Each editor offers Deal two in app or Enter two physical draws. The app deals two random catalogue cards; choose one and Save. Both cards are reserved, and reopening or recovering the app keeps the same pair. For physical draws, enter both names, choose one and Save. Catalogue and custom entries remain available for corrections.</ns0:t>
       </ns0:r>
     </ns0:p>
     <ns0:p>
@@ -723,7 +723,13 @@
         </ns0:numPr>
       </ns0:pPr>
       <ns0:r>
-        <ns0:t>Skill markers, sanity loss, edited ability text and assigned cards survive closing the app. Back to setup keeps assignments. Set up rematch returns to setup with empty card slots and reset markers, while keeping investigators, edited ability text and the Use relics option. Assign fresh cards before starting the next game. Choosing a different investigator clears their dashboard.</ns0:t>
+        <ns0:t>Skill markers, sanity loss, edited ability text, cards and app-dealt pairs survive closing the app. Back to setup keeps cards and pairs, resets markers and clears acquired extra abilities. Set up rematch also clears cards and pairs, keeping investigators, edits to their original three skills, Use relics and Draw two, pick one. Assign fresh cards before starting. Choosing a different investigator clears their dashboard.</ns0:t>
+      </ns0:r>
+    </ns0:p>
+    <ns0:p>
+      <ns0:pPr/>
+      <ns0:r>
+        <ns0:t>Phases of your turn is available in setup, on the active investigator and in Game menu. Open it whenever needed for the action, Mythos, safe Discovery or enemy-attack, and end-of-turn sequence. It is a reminder only; close it and use Pass when finished. Follow episode and expansion exceptions from your physical game.</ns0:t>
       </ns0:r>
     </ns0:p>
     <ns0:p>

</xml_diff>

<commit_message>
Android: add condition and relic rule drafts with physical review
</commit_message>
<xml_diff>
--- a/Documentation/User Manual/TurnHub App Manual V0.21.docx
+++ b/Documentation/User Manual/TurnHub App Manual V0.21.docx
@@ -713,6 +713,12 @@
       <ns0:pPr/>
       <ns0:r>
         <ns0:t>View card reference opens a community photograph where available. Some images show paired cards or both relic faces. Pinch and drag, or use Zoom in, Zoom out and Fit to read it. Images download only when opened and remain cached for offline use; Retry tries an unavailable download again. A missing image never blocks assignment. Enter rules and reminders from your printed card. Renaming a catalogue card makes it a custom entry and removes its old image reference.</ns0:t>
+      </ns0:r>
+    </ns0:p>
+    <ns0:p>
+      <ns0:pPr/>
+      <ns0:r>
+        <ns0:t>Review condition &amp; relic rules in setup lets you check the full catalogue without assigning an investigator. Draft reminders are available for 20 conditions and both faces of 10 relics; other rules need your card or a readable scan. Compare every effect with your physical card, including setup instructions, timing, numbers, symbols and exceptions. For relics, add the printed flip requirement to starting-face notes and check both faces separately. Correct the text, check only the faces you compared, then Save reference. Your corrections and checks survive closing the app and rematches and prefill future selections. Existing match notes stay unchanged; Fill missing rules from reference fills only blank fields. Editing a name or face text clears its check. Checks are reminders, never automatic game effects or a requirement to start.</ns0:t>
       </ns0:r>
     </ns0:p>
     <ns0:p>

</xml_diff>

<commit_message>
Track elimination credit in shared statistics and support ten app players
</commit_message>
<xml_diff>
--- a/Documentation/User Manual/TurnHub App Manual V0.21.docx
+++ b/Documentation/User Manual/TurnHub App Manual V0.21.docx
@@ -429,6 +429,9 @@
       <ns0:r>
         <ns0:t>. The table preview shows the seats as players join, even before there are two.</ns0:t>
       </ns0:r>
+      <ns0:r>
+        <ns0:t xml:space="preserve"> A local game supports up to ten players, within the chosen mode’s player limits.</ns0:t>
+      </ns0:r>
     </ns0:p>
     <ns0:p>
       <ns0:pPr>
@@ -1438,6 +1441,9 @@
       <ns0:r>
         <ns0:t>Concede records a voluntary exit and Eliminate records a loss; both take the player out of turn order, and statistics count them separately.</ns0:t>
       </ns0:r>
+      <ns0:r>
+        <ns0:t xml:space="preserve"> For Eliminate, choose Elimination credit to name the opponent responsible, or No player credited. Concessions and automatic removals award no credit. A team removal counts as two opponents eliminated.</ns0:t>
+      </ns0:r>
     </ns0:p>
     <ns0:p>
       <ns0:pPr>
@@ -1859,6 +1865,9 @@
       </ns0:r>
       <ns0:r>
         <ns0:t xml:space="preserve"> sends their statistics as text.</ns0:t>
+      </ns0:r>
+      <ns0:r>
+        <ns0:t xml:space="preserve"> Opponents eliminated counts explicitly credited removals across all game modes. Credit stays in history and shared results and imports with the match.</ns0:t>
       </ns0:r>
     </ns0:p>
     <ns0:p>

</xml_diff>

<commit_message>
Add Commander Bag of Doom mode with durable draws and elimination resets
</commit_message>
<xml_diff>
--- a/Documentation/User Manual/TurnHub App Manual V0.21.docx
+++ b/Documentation/User Manual/TurnHub App Manual V0.21.docx
@@ -592,6 +592,12 @@
       </ns0:r>
     </ns0:p>
     <ns0:p>
+      <ns0:pPr/>
+      <ns0:r>
+        <ns0:t>Bag of Doom: five or more Commander players, with a bag that eliminates a random eligible player after timed turn cycles.</ns0:t>
+      </ns0:r>
+    </ns0:p>
+    <ns0:p>
       <ns0:pPr>
         <ns0:numPr>
           <ns0:ilvl ns0:val="0"/>
@@ -915,6 +921,44 @@
       </ns0:r>
       <ns0:r>
         <ns0:t xml:space="preserve"> offers a rematch that reseats the same five players so your allies become your enemies.</ns0:t>
+      </ns0:r>
+    </ns0:p>
+    <ns0:p>
+      <ns0:pPr>
+        <ns0:pStyle ns0:val="Heading2"/>
+      </ns0:pPr>
+      <ns0:r>
+        <ns0:t>Bag of Doom</ns0:t>
+      </ns0:r>
+    </ns0:p>
+    <ns0:p>
+      <ns0:pPr/>
+      <ns0:r>
+        <ns0:t>Choose Commander, then Bag of Doom under Game mode. This custom variant needs at least five players; a phone-hosted table supports ten. Everyone starts at 40 life with normal Commander rules. It is inspired by Game Knights’ ten-player game.</ns0:t>
+      </ns0:r>
+    </ns0:p>
+    <ns0:p>
+      <ns0:pPr/>
+      <ns0:r>
+        <ns0:t>Everyone begins in the bag. If another player loses life during your turn, your name comes out—even if they paid that life themselves. Your own life loss does not save you. Commander damage counts. Correct a mistaken entry in the bag panel; healing or undoing damage does not put your name back automatically.</ns0:t>
+      </ns0:r>
+    </ns0:p>
+    <ns0:p>
+      <ns0:pPr/>
+      <ns0:r>
+        <ns0:t>The first bag check follows four complete turn cycles. Afterward, check once per cycle. The game pauses before the next turn. Resolve pending life requests, review who is In bag or Safe, then Draw from bag. A random name still in the bag is eliminated. An empty bag eliminates nobody. Every check refills the bag and resets immunity. Continue game resumes the next turn.</ns0:t>
+      </ns0:r>
+    </ns0:p>
+    <ns0:p>
+      <ns0:pPr/>
+      <ns0:r>
+        <ns0:t>Crediting an elimination refills the bag except for that player and moves its deadline to the living player before them. This starts a one-cycle check, even during the opening four cycles. Use Credit an earlier elimination after an automatic removal. Concessions and players drawn from the bag give nobody elimination credit. At four survivors, the bag switches off.</ns0:t>
+      </ns0:r>
+    </ns0:p>
+    <ns0:p>
+      <ns0:pPr/>
+      <ns0:r>
+        <ns0:t>On the shared tablet, open Bag of Doom in the game menu. Personal phones show it in Game. Review life totals closes a due check so you can fix life entries, then reopen the bag. Draw results are saved before they appear; if saving fails, retry keeps the same reserved choice on Atlas. Reopening the panel cannot reroll a completed check. TurnHub uses reset-after-every-check rules, which may differ from another group’s version.</ns0:t>
       </ns0:r>
     </ns0:p>
     <ns0:p>

</xml_diff>

<commit_message>
Make bag checks full-screen and ask for explicit elimination sources
</commit_message>
<xml_diff>
--- a/Documentation/User Manual/TurnHub App Manual V0.21.docx
+++ b/Documentation/User Manual/TurnHub App Manual V0.21.docx
@@ -952,13 +952,13 @@
     <ns0:p>
       <ns0:pPr/>
       <ns0:r>
-        <ns0:t>Crediting an elimination refills the bag except for that player and moves its deadline to the living player before them. This starts a one-cycle check, even during the opening four cycles. Use Credit an earlier elimination after an automatic removal. Concessions and players drawn from the bag give nobody elimination credit. At four survivors, the bag switches off.</ns0:t>
-      </ns0:r>
-    </ns0:p>
-    <ns0:p>
-      <ns0:pPr/>
-      <ns0:r>
-        <ns0:t>On the shared tablet, open Bag of Doom in the game menu. Personal phones show it in Game. Review life totals closes a due check so you can fix life entries, then reopen the bag. Draw results are saved before they appear; if saving fails, retry keeps the same reserved choice on Atlas. Reopening the panel cannot reroll a completed check. TurnHub uses reset-after-every-check rules, which may differ from another group’s version.</ns0:t>
+        <ns0:t>Crediting an elimination refills the bag except for that player and moves its deadline to the living player before them. This starts a one-cycle check, even during the opening four cycles. Choose the actual opponent in “Eliminated by?”, including off-turn interactions. Self and Unknown give nobody credit and do not reset the bag. Credit an earlier elimination can correct an Unknown while the game continues. Concessions and players drawn from the bag give nobody elimination credit. At four survivors, the bag switches off.</ns0:t>
+      </ns0:r>
+    </ns0:p>
+    <ns0:p>
+      <ns0:pPr/>
+      <ns0:r>
+        <ns0:t>A due bag check and its result open a full-screen pop-up on the shared tablet and on personal phones. Review life totals closes it so you can fix life entries; reopen Bag of Doom from the tablet menu or Game to finish the check. Answer any “Eliminated by?” question first. Draw results are saved before they appear; if saving fails, retry keeps the same reserved choice on Atlas. Reopening the panel cannot reroll a completed check. TurnHub uses reset-after-every-check rules.</ns0:t>
       </ns0:r>
     </ns0:p>
     <ns0:p>
@@ -1483,10 +1483,7 @@
     <ns0:p>
       <ns0:pPr/>
       <ns0:r>
-        <ns0:t>Concede records a voluntary exit and Eliminate records a loss; both take the player out of turn order, and statistics count them separately.</ns0:t>
-      </ns0:r>
-      <ns0:r>
-        <ns0:t xml:space="preserve"> For Eliminate, choose Elimination credit to name the opponent responsible, or No player credited. Concessions and automatic removals award no credit. A team removal counts as two opponents eliminated.</ns0:t>
+        <ns0:t>Concede records a voluntary exit and Eliminate records a loss. Eliminate opens a full-screen “Eliminated by?” question. Choose the actual opponent, Self, or Unknown; no answer is selected for you. Off-turn and already-eliminated opponents can receive credit. Self and Unknown award no opponent credit. Automatic removals in app-started games ask the same question and pause play. Even the final elimination waits for an answer before the result enters history and stats. Concessions and bag draws already have known causes and skip this question. Pending questions survive closing the app; answer them, then resume if the game continues.</ns0:t>
       </ns0:r>
     </ns0:p>
     <ns0:p>

</xml_diff>

<commit_message>
Add phone-hosted Death May Die with shared displays and investigator clients
</commit_message>
<xml_diff>
--- a/Documentation/User Manual/TurnHub App Manual V0.21.docx
+++ b/Documentation/User Manual/TurnHub App Manual V0.21.docx
@@ -745,6 +745,39 @@
       <ns0:pPr/>
       <ns0:r>
         <ns0:t>Phases of your turn is available in setup, on the active investigator and in Game menu. Open it whenever needed for the action, Mythos, safe Discovery or enemy-attack, and end-of-turn sequence. It is a reminder only; close it and use Pass when finished. Follow episode and expansion exceptions from your physical game.</ns0:t>
+      </ns0:r>
+    </ns0:p>
+    <ns0:p>
+      <ns0:pPr>
+        <ns0:pStyle ns0:val="Heading3"/>
+      </ns0:pPr>
+      <ns0:r>
+        <ns0:t>Play together on the same Wi-Fi</ns0:t>
+      </ns0:r>
+    </ns0:p>
+    <ns0:p>
+      <ns0:r>
+        <ns0:t>One TurnHub device can host Death May Die while other Android devices show the Elder One board or their own investigator cards. Start the game on the host, then open Game &gt; Play together &gt; Host game. Keep the host app open; it saves the game and its result. Atlas and internet access are not required.</ns0:t>
+      </ns0:r>
+    </ns0:p>
+    <ns0:p>
+      <ns0:r>
+        <ns0:t>On another device connected to the same Wi-Fi, choose Game &gt; Play together. Scan the host’s invitation, or paste a copied invitation and tap Find game. Choose Use as Elder One display or the investigator you play. Only one guest device can control each investigator. The host retains all controls. Share invitations only with your table.</ns0:t>
+      </ns0:r>
+    </ns0:p>
+    <ns0:p>
+      <ns0:r>
+        <ns0:t>The Elder One display follows the host’s track, ritual, stage, wounds and episode tokens. Investigator devices show their skills and assigned cards, including both relic faces. Players can change wounds, stress, fire, insanity and skill levels, stage their next turn, choose a pass recipient, and confirm their investigator’s death. Card assignment and reference edits remain on the host.</ns0:t>
+      </ns0:r>
+    </ns0:p>
+    <ns0:p>
+      <ns0:r>
+        <ns0:t>Connection loss keeps the last display and disables edits. If a reply is lost, use Retry last action; do not enter the change a second time. Returning to the host app allows guests to reconnect. If the host closes, changes Wi-Fi, starts another game or restarts sharing, a fresh invitation may be needed. Guests never take over or save a duplicate match or statistics.</ns0:t>
+      </ns0:r>
+    </ns0:p>
+    <ns0:p>
+      <ns0:r>
+        <ns0:t>Game &gt; Play together on the host lists connected devices and lets you disconnect one or Stop sharing. Stopping sharing keeps the local game. Back to game leaves hosting active. Nearby devices permission is needed on Android 17 or later; camera permission is optional for scanning. Guest-isolated Wi-Fi can prevent devices from reaching each other.</ns0:t>
       </ns0:r>
     </ns0:p>
     <ns0:p>

</xml_diff>

<commit_message>
Death May Die: threshold level-ups, investigator device polish, enemies
- Insanity thresholds owe a skill level-up; the alert offers a Resolve
  button per skill, and level chips hide behind "Correct skill levels".
- Investigator devices: portrait, tinted tracks with the fire reminder
  under Fire, distinct insanity and relic cards, and a read-only Elder
  One view that switches without reconnecting.
- Elder One tab: minions and episode monsters, typed once from the card
  and saved on the device; a rematch clears the map.
- Word App Manual brought in line with the shipped manual asset, which
  fixes master's manual check.

Co-Authored-By: Claude Opus 5.5 (1M context) <noreply@anthropic.com>
Claude-Session: https://claude.ai/code/session_01QjweGGfLC4rUMZv8GrE6kw
</commit_message>
<xml_diff>
--- a/Documentation/User Manual/TurnHub App Manual V0.21.docx
+++ b/Documentation/User Manual/TurnHub App Manual V0.21.docx
@@ -693,18 +693,29 @@
         </ns0:numPr>
       </ns0:pPr>
       <ns0:r>
-        <ns0:t>Each investigator starts with three skill markers, with levels 1 to 4. Tap a level to move its marker; earlier effects still apply unless a later effect says instead. Preview upgrades shows future effects without moving a marker. The ten core-box investigators include complete summaries; indexed investigators also include known common skills. Edit abilities lets you correct names and all four effects, add a common skill such as Swiftness or a custom ability, and remove added skills. Up to eight skills are supported. Added skills start at level 1; move their markers to match the granting effect. Apply all effects to the physical game.</ns0:t>
-      </ns0:r>
-    </ns0:p>
-    <ns0:p>
-      <ns0:pPr>
-        <ns0:numPr>
-          <ns0:ilvl ns0:val="0"/>
-          <ns0:numId ns0:val="1"/>
-        </ns0:numPr>
-      </ns0:pPr>
-      <ns0:r>
-        <ns0:t>The Insanity counter records sanity loss. It stops at each insanity threshold and shows bonus dice. Resolve your insanity card and choose a skill upgrade on the physical dashboard when prompted. The minus button corrects an entry; it does not mean sanity can normally be healed. Reaching the end of the track does not automatically end a player’s game: use their menu to resolve the outcome.</ns0:t>
+        <ns0:t>Each investigator starts with three skill markers, with levels 1 to 4. Skills level up from the insanity threshold alert: it names your insanity card, then offers a Resolve button for each skill that can still rise. Correct skill levels shows the level buttons for fixing a mistake. Earlier effects still apply unless a later effect says instead. Preview upgrades shows future effects without moving a marker. The ten core-box investigators include complete summaries; indexed investigators also include known common skills. Edit abilities lets you correct names and all four effects, add a common skill such as Swiftness or a custom ability, and remove added skills. Up to eight skills are supported. Added skills start at level 1; move their markers to match the granting effect. Apply all effects to the physical game.</ns0:t>
+      </ns0:r>
+    </ns0:p>
+    <ns0:p>
+      <ns0:pPr>
+        <ns0:numPr>
+          <ns0:ilvl ns0:val="0"/>
+          <ns0:numId ns0:val="1"/>
+        </ns0:numPr>
+      </ns0:pPr>
+      <ns0:r>
+        <ns0:t>The Insanity counter records sanity loss. It stops at each insanity threshold and shows bonus dice. Each threshold reached owes one skill level-up: resolve your insanity card, then tap Resolve on the skill you level up. The alert stays until you do. The minus button corrects an entry; it does not mean sanity can normally be healed. Reaching the end of the track does not automatically end a player’s game: use their menu to resolve the outcome.</ns0:t>
+      </ns0:r>
+    </ns0:p>
+    <ns0:p>
+      <ns0:pPr>
+        <ns0:numPr>
+          <ns0:ilvl ns0:val="0"/>
+          <ns0:numId ns0:val="1"/>
+        </ns0:numPr>
+      </ns0:pPr>
+      <ns0:r>
+        <ns0:t>The Elder One tab follows the Story board: the Summoning track, the Elder One’s stages, its minions (cultists and its special monster), the episode’s monsters and episode tokens. Add a minion or monster as it reaches the map. The first time, copy its name, health and attack dice from its card; this device remembers the card, so later it is one tap. Wound each figure with − and +, and remove it when it dies or leaves. A rematch clears the map and keeps the saved cards.</ns0:t>
       </ns0:r>
     </ns0:p>
     <ns0:p>
@@ -757,27 +768,32 @@
     </ns0:p>
     <ns0:p>
       <ns0:r>
-        <ns0:t>One TurnHub device can host Death May Die while other Android devices show the Elder One board or their own investigator cards. Start the game on the host, then open Game &gt; Play together &gt; Host game. Keep the host app open; it saves the game and its result. Atlas and internet access are not required.</ns0:t>
-      </ns0:r>
-    </ns0:p>
-    <ns0:p>
-      <ns0:r>
-        <ns0:t>On another device connected to the same Wi-Fi, choose Game &gt; Play together. Scan the host’s invitation, or paste a copied invitation and tap Find game. Choose Use as Elder One display or the investigator you play. Only one guest device can control each investigator. The host retains all controls. Share invitations only with your table.</ns0:t>
-      </ns0:r>
-    </ns0:p>
-    <ns0:p>
-      <ns0:r>
-        <ns0:t>The Elder One display follows the host’s track, ritual, stage, wounds and episode tokens. Investigator devices show their skills and assigned cards, including both relic faces. Players can change wounds, stress, fire, insanity and skill levels, stage their next turn, choose a pass recipient, and confirm their investigator’s death. Card assignment and reference edits remain on the host.</ns0:t>
-      </ns0:r>
-    </ns0:p>
-    <ns0:p>
-      <ns0:r>
-        <ns0:t>Connection loss keeps the last display and disables edits. If a reply is lost, use Retry last action; do not enter the change a second time. Returning to the host app allows guests to reconnect. If the host closes, changes Wi-Fi, starts another game or restarts sharing, a fresh invitation may be needed. Guests never take over or save a duplicate match or statistics.</ns0:t>
-      </ns0:r>
-    </ns0:p>
-    <ns0:p>
-      <ns0:r>
-        <ns0:t>Game &gt; Play together on the host lists connected devices and lets you disconnect one or Stop sharing. Stopping sharing keeps the local game. Back to game leaves hosting active. Nearby devices permission is needed on Android 17 or later; camera permission is optional for scanning. Guest-isolated Wi-Fi can prevent devices from reaching each other.</ns0:t>
+        <ns0:t>One TurnHub device can host Magic (including Commander variants and Two-Headed Giant), Yu-Gi-Oh!, Pokémon, Lorcana or Death May Die. Other devices control their own player; Death May Die also offers the Elder One board. On the host, choose the game, then open Game &gt; Play together &gt; Host game; you can do this in the lobby. The host shows a join code like ABC-123 on Play together and at the top of the Game and Table tabs. It stays the same for the whole session, including rematches, until you stop sharing. Keep the host app open; it saves the game and its result. Atlas and internet access are not required.</ns0:t>
+      </ns0:r>
+    </ns0:p>
+    <ns0:p>
+      <ns0:r>
+        <ns0:t>On another device connected to the same Wi-Fi, choose Game &gt; Play together, enter the join code and tap Find game. If the host turned on Guests must scan a QR code (Settings, or the Host card), it shows a QR code instead: tap Scan QR code. Under Choose your seat, choose your player (or Elder One display/investigator for Death May Die). Only one guest device can control each player. The host retains all controls. Share invitations only with your table.</ns0:t>
+      </ns0:r>
+    </ns0:p>
+    <ns0:p>
+      <ns0:r>
+        <ns0:t>For TCG games, your screen uses the same player panel and counter menu as the table. You can change your own life/score, counters and Commander damage received, pass your turn, use an earned extension, claim monarch, claim a win or concede. Table · read only shows all players with editing disabled; My player returns to your controls without reconnecting or releasing your seat. Two-Headed Giant life and poison remain shared, and either teammate can pass. Setup, game-wide controls, Planechase and Bag of Doom decisions stay on the host.</ns0:t>
+      </ns0:r>
+    </ns0:p>
+    <ns0:p>
+      <ns0:r>
+        <ns0:t>The Elder One display follows the host’s track, ritual, stage, wounds, minions, episode monsters and episode tokens. Investigator devices show the investigator’s picture, skills and assigned cards, including both relic faces; the insanity card and relic each have their own color. My investigator and Elder One · read only switch between your controls and the Elder One board without leaving or reconnecting. Guests who join in the lobby wait there; their controls unlock when the game starts. Players can change wounds, stress, fire, insanity and skill levels, stage their next turn, choose a pass recipient, and confirm their investigator’s death. Card assignment and reference edits remain on the host.</ns0:t>
+      </ns0:r>
+    </ns0:p>
+    <ns0:p>
+      <ns0:r>
+        <ns0:t>Connection loss keeps the last display and disables edits. If a reply is lost, use Retry last action; do not enter the change a second time. Returning to the host app allows guests to reconnect. If the host closes, changes Wi-Fi or restarts sharing, guests need the new code or QR. Guests never take over or save a duplicate match or statistics.</ns0:t>
+      </ns0:r>
+    </ns0:p>
+    <ns0:p>
+      <ns0:r>
+        <ns0:t>Game &gt; Play together on the host lists connected devices and lets you disconnect one or Stop sharing (tap it twice to confirm). Stopping sharing keeps the local game. Back to game leaves hosting active. Nearby devices permission is needed on Android 17 or later; camera permission is optional for scanning. Guest-isolated Wi-Fi can prevent devices from reaching each other.</ns0:t>
       </ns0:r>
     </ns0:p>
     <ns0:p>

</xml_diff>

<commit_message>
Android: guest looks, win approval and host single-player view
Guests draw the host's seat colors, avatars, backgrounds and commander art.
A guest's win claim waits for the other players to confirm in turn order, as a
Sigil's does. The host table can show just one player's panel when the group
has no central display.

Co-Authored-By: Claude Opus 5.5 (1M context) <noreply@anthropic.com>
Claude-Session: https://claude.ai/code/session_01QjweGGfLC4rUMZv8GrE6kw
</commit_message>
<xml_diff>
--- a/Documentation/User Manual/TurnHub App Manual V0.21.docx
+++ b/Documentation/User Manual/TurnHub App Manual V0.21.docx
@@ -778,7 +778,7 @@
     </ns0:p>
     <ns0:p>
       <ns0:r>
-        <ns0:t>For TCG games, your screen uses the same player panel and counter menu as the table. You can change your own life/score, counters and Commander damage received, pass your turn, use an earned extension, claim monarch, claim a win or concede. Table · read only shows all players with editing disabled; My player returns to your controls without reconnecting or releasing your seat. Two-Headed Giant life and poison remain shared, and either teammate can pass. Setup, game-wide controls, Planechase and Bag of Doom decisions stay on the host.</ns0:t>
+        <ns0:t>For TCG games, your screen uses the same player panel and counter menu as the table. You can change your own life/score, counters and Commander damage received, pass your turn, use an earned extension, claim monarch, claim a win or concede. A win claim waits for the other players to confirm it one at a time, as on a Sigil; one denial cancels it. Panels show each player's color, picture, background and commander art as they appear on the host. Table · read only shows all players with editing disabled; My player returns to your controls without reconnecting or releasing your seat. Two-Headed Giant life and poison remain shared, and either teammate can pass. Setup, game-wide controls, Planechase and Bag of Doom decisions stay on the host.</ns0:t>
       </ns0:r>
     </ns0:p>
     <ns0:p>
@@ -794,6 +794,11 @@
     <ns0:p>
       <ns0:r>
         <ns0:t>Game &gt; Play together on the host lists connected devices and lets you disconnect one or Stop sharing (tap it twice to confirm). Stopping sharing keeps the local game. Back to game leaves hosting active. Nearby devices permission is needed on Android 17 or later; camera permission is optional for scanning. Guest-isolated Wi-Fi can prevent devices from reaching each other.</ns0:t>
+      </ns0:r>
+    </ns0:p>
+    <ns0:p>
+      <ns0:r>
+        <ns0:t>If the group has no central screen, the host can play from their own device too: in the game menu under Show on this device, choose Only and a player's name to show just their panel, or Whole table to go back. A win claimed from that view waits for the other players' confirmation, and the player who needs to answer appears on the host's screen until they do.</ns0:t>
       </ns0:r>
     </ns0:p>
     <ns0:p>

</xml_diff>

<commit_message>
Manual: Emperor in the App Manual source
The in-app manual is exported from the .docx; add the same Emperor text
there so export_manual.py --check passes.

Co-Authored-By: Claude Opus 5.5 (1M context) <noreply@anthropic.com>
Claude-Session: https://claude.ai/code/session_01FotRcaqPEpwtEqEcnLPrJK
</commit_message>
<xml_diff>
--- a/Documentation/User Manual/TurnHub App Manual V0.21.docx
+++ b/Documentation/User Manual/TurnHub App Manual V0.21.docx
@@ -625,6 +625,24 @@
         <ns0:rPr>
           <ns0:b/>
         </ns0:rPr>
+        <ns0:t>Emperor:</ns0:t>
+      </ns0:r>
+      <ns0:r>
+        <ns0:rPr/>
+        <ns0:t xml:space="preserve"> exactly six players in two teams of three, with Magic (20 life) or Commander (40) decks. Phone-hosted games only.</ns0:t>
+      </ns0:r>
+    </ns0:p>
+    <ns0:p>
+      <ns0:pPr>
+        <ns0:numPr>
+          <ns0:ilvl ns0:val="0"/>
+          <ns0:numId ns0:val="1"/>
+        </ns0:numPr>
+      </ns0:pPr>
+      <ns0:r>
+        <ns0:rPr>
+          <ns0:b/>
+        </ns0:rPr>
         <ns0:t>Yu-Gi-Oh!:</ns0:t>
       </ns0:r>
       <ns0:r>
@@ -634,7 +652,7 @@
     <ns0:p>
       <ns0:pPr/>
       <ns0:r>
-        <ns0:t xml:space="preserve">Official modes (Magic, Commander, Two-Headed Giant and Yu-Gi-Oh!) keep their official starting life, poison limit and player count. Turn on </ns0:t>
+        <ns0:t xml:space="preserve">Official modes (Magic, Commander, Two-Headed Giant, Emperor and Yu-Gi-Oh!) keep their official starting life, poison limit and player count. Turn on </ns0:t>
       </ns0:r>
       <ns0:r>
         <ns0:rPr>
@@ -643,7 +661,7 @@
         <ns0:t>House rules</ns0:t>
       </ns0:r>
       <ns0:r>
-        <ns0:t xml:space="preserve"> in setup to change them; any whole number from 0 to 1,000,000 is allowed. Two-Headed Giant Commander, Star Commander and Generic are custom modes. </ns0:t>
+        <ns0:t xml:space="preserve"> in setup to change them; any whole number from 0 to 1,000,000 is allowed. Two-Headed Giant Commander, Commander Emperor, Star Commander and Generic are custom modes. </ns0:t>
       </ns0:r>
       <ns0:r>
         <ns0:rPr>
@@ -975,6 +993,94 @@
       </ns0:r>
       <ns0:r>
         <ns0:t xml:space="preserve"> offers a rematch that reseats the same five players so your allies become your enemies.</ns0:t>
+      </ns0:r>
+    </ns0:p>
+    <ns0:p>
+      <ns0:pPr>
+        <ns0:pStyle ns0:val="Heading2"/>
+      </ns0:pPr>
+      <ns0:r>
+        <ns0:rPr/>
+        <ns0:t>Emperor</ns0:t>
+      </ns0:r>
+    </ns0:p>
+    <ns0:p>
+      <ns0:pPr/>
+      <ns0:r>
+        <ns0:rPr/>
+        <ns0:t>Choose Magic or Commander, then Emperor under Game mode. Six players sit as two teams of three: players 1 to 3 are Team A and 4 to 6 Team B. The middle player of each team (2 and 5) is its emperor, with a general on each side. The table puts each team along one side with the emperor's larger panel in the middle, so the generals face the other team's generals. Swap seats in setup to choose who plays emperor.</ns0:t>
+      </ns0:r>
+    </ns0:p>
+    <ns0:p>
+      <ns0:pPr>
+        <ns0:numPr>
+          <ns0:ilvl ns0:val="0"/>
+          <ns0:numId ns0:val="1"/>
+        </ns0:numPr>
+      </ns0:pPr>
+      <ns0:r>
+        <ns0:rPr/>
+        <ns0:t>Everyone keeps their own life, turns and counters. Teammates can look at each other's hands but don't share cards, mana or life.</ns0:t>
+      </ns0:r>
+    </ns0:p>
+    <ns0:p>
+      <ns0:pPr>
+        <ns0:numPr>
+          <ns0:ilvl ns0:val="0"/>
+          <ns0:numId ns0:val="1"/>
+        </ns0:numPr>
+      </ns0:pPr>
+      <ns0:r>
+        <ns0:rPr/>
+        <ns0:t>Emperors reach two seats and generals one: you can only target and affect players that close. You can attack only an opponent sitting right next to you, so at the start the emperors can't attack anyone. Each panel shows who that player can attack and, on wider panels, who they reach.</ns0:t>
+      </ns0:r>
+    </ns0:p>
+    <ns0:p>
+      <ns0:pPr>
+        <ns0:numPr>
+          <ns0:ilvl ns0:val="0"/>
+          <ns0:numId ns0:val="1"/>
+        </ns0:numPr>
+      </ns0:pPr>
+      <ns0:r>
+        <ns0:rPr/>
+        <ns0:t>When a player is out, the others close the gap and the ranges update. The rules work them out again as the next turn begins, so finish the current turn with the old ranges.</ns0:t>
+      </ns0:r>
+    </ns0:p>
+    <ns0:p>
+      <ns0:pPr>
+        <ns0:numPr>
+          <ns0:ilvl ns0:val="0"/>
+          <ns0:numId ns0:val="1"/>
+        </ns0:numPr>
+      </ns0:pPr>
+      <ns0:r>
+        <ns0:rPr/>
+        <ns0:t>Any creature can be tapped to give it to a teammate within your range, as a sorcery. TurnHub can't see the cards, so the table keeps this rule.</ns0:t>
+      </ns0:r>
+    </ns0:p>
+    <ns0:p>
+      <ns0:pPr>
+        <ns0:numPr>
+          <ns0:ilvl ns0:val="0"/>
+          <ns0:numId ns0:val="1"/>
+        </ns0:numPr>
+      </ns0:pPr>
+      <ns0:r>
+        <ns0:rPr/>
+        <ns0:t>A random emperor goes first. An emperor's panel glows gold on their turn; generals glow in the usual colour.</ns0:t>
+      </ns0:r>
+    </ns0:p>
+    <ns0:p>
+      <ns0:pPr>
+        <ns0:numPr>
+          <ns0:ilvl ns0:val="0"/>
+          <ns0:numId ns0:val="1"/>
+        </ns0:numPr>
+      </ns0:pPr>
+      <ns0:r>
+        <ns0:rPr/>
+        <ns0:t>The game ends the moment an emperor is out: the other team wins together, including any of its generals already out. Teammates can't deal each other Commander damage.</ns0:t>
       </ns0:r>
     </ns0:p>
     <ns0:p>

</xml_diff>

<commit_message>
App manual: Game is one tab for Atlas and device games
Updates the App Manual docx and regenerates the bundled manual.md, which
CI checks against it.

Co-Authored-By: Claude Opus 5.5 <noreply@anthropic.com>
Claude-Session: https://claude.ai/code/session_014DUoHHbJhbkmzuGKFNACYz
</commit_message>
<xml_diff>
--- a/Documentation/User Manual/TurnHub App Manual V0.21.docx
+++ b/Documentation/User Manual/TurnHub App Manual V0.21.docx
@@ -2252,7 +2252,7 @@
     <ns0:p>
       <ns0:pPr/>
       <ns0:r>
-        <ns0:t xml:space="preserve">Atlas discovery stays on in the background and reconnects to a known Atlas when the phone is on its network. Turning it off disconnects. With an Atlas connected, </ns0:t>
+        <ns0:t xml:space="preserve">Atlas discovery stays on in the background and reconnects to a known Atlas when the phone is on its network. Turning it off disconnects. </ns0:t>
       </ns0:r>
       <ns0:r>
         <ns0:rPr>
@@ -2261,25 +2261,7 @@
         <ns0:t>Game</ns0:t>
       </ns0:r>
       <ns0:r>
-        <ns0:t xml:space="preserve"> lets you choose </ns0:t>
-      </ns0:r>
-      <ns0:r>
-        <ns0:rPr>
-          <ns0:b/>
-        </ns0:rPr>
-        <ns0:t>This device</ns0:t>
-      </ns0:r>
-      <ns0:r>
-        <ns0:t xml:space="preserve"> or </ns0:t>
-      </ns0:r>
-      <ns0:r>
-        <ns0:rPr>
-          <ns0:b/>
-        </ns0:rPr>
-        <ns0:t>Atlas</ns0:t>
-      </ns0:r>
-      <ns0:r>
-        <ns0:t>, and Players adds Table and Me sections.</ns0:t>
+        <ns0:t xml:space="preserve"> is one tab whichever runs the game. With an Atlas connected it shows the Atlas table's game, unless this device already has a game under way; a line at the top says where you are playing and, while setting up (or when the other has a game going), offers to switch. Players adds Table and Me sections.</ns0:t>
       </ns0:r>
     </ns0:p>
     <ns0:p>

</xml_diff>

<commit_message>
App manual: Bring players to this table and guest imports in the source .docx
The in-app manual is generated from the .docx; CI's export check needs both.

Co-Authored-By: Claude Opus 5.5 <noreply@anthropic.com>
Claude-Session: https://claude.ai/code/session_014DUoHJEEwspFP2zxdNJKUc
</commit_message>
<xml_diff>
--- a/Documentation/User Manual/TurnHub App Manual V0.21.docx
+++ b/Documentation/User Manual/TurnHub App Manual V0.21.docx
@@ -2522,7 +2522,37 @@
     <ns0:p>
       <ns0:pPr/>
       <ns0:r>
-        <ns0:t>Once every player in a finished local game is linked to an account on that Atlas, the game is added to their Atlas statistics automatically. Other games can be matched to Atlas accounts by hand in History. A local game is never deleted by importing it.</ns0:t>
+        <ns0:rPr>
+          <ns0:b/>
+        </ns0:rPr>
+        <ns0:t>Bring players to this table</ns0:t>
+      </ns0:r>
+      <ns0:r>
+        <ns0:t xml:space="preserve"> (in </ns0:t>
+      </ns0:r>
+      <ns0:r>
+        <ns0:rPr>
+          <ns0:b/>
+        </ns0:rPr>
+        <ns0:t>Players</ns0:t>
+      </ns0:r>
+      <ns0:r>
+        <ns0:t xml:space="preserve"> once the Atlas accounts are loaded) lists every player on this device and where they stand with that Atlas. Players without a PIN go over together in one tap while you're signed in; the first person to sign in to one sets its PIN. A player with a PIN goes over when you enter it. A player whose ID is already on that Atlas is linked from </ns0:t>
+      </ns0:r>
+      <ns0:r>
+        <ns0:rPr>
+          <ns0:b/>
+        </ns0:rPr>
+        <ns0:t>Edit</ns0:t>
+      </ns0:r>
+      <ns0:r>
+        <ns0:t xml:space="preserve"> with that account's PIN.</ns0:t>
+      </ns0:r>
+    </ns0:p>
+    <ns0:p>
+      <ns0:pPr/>
+      <ns0:r>
+        <ns0:t>Once a player in a finished local game is linked to an account on that Atlas, the game is added to their Atlas statistics automatically (Atlas 0.7.16 or later; older Atlases need every player linked). Players not linked yet count as guests, and get the game added when they're linked later. Other games can be matched to Atlas accounts by hand in History. A local game is never deleted by importing it.</ns0:t>
       </ns0:r>
     </ns0:p>
     <ns0:p>

</xml_diff>

<commit_message>
Docs: profile sync and Admin account merge in the App Manual, http-v1 and staged work
Co-Authored-By: Claude Opus 5.5 <noreply@anthropic.com>
Claude-Session: https://claude.ai/code/session_014DUoHJEEwspFP2zxdNJKUc
</commit_message>
<xml_diff>
--- a/Documentation/User Manual/TurnHub App Manual V0.21.docx
+++ b/Documentation/User Manual/TurnHub App Manual V0.21.docx
@@ -2552,6 +2552,12 @@
     <ns0:p>
       <ns0:pPr/>
       <ns0:r>
+        <ns0:t>A linked player stays in sync with that Atlas whenever the app loads its accounts (Atlas 0.7.18 or later). Name, color, avatar and reduced motion follow whichever copy was changed most recently. PINs stay separate on each device, and statistics only travel with games. The player shows how many games they have played and won on that Atlas.</ns0:t>
+      </ns0:r>
+    </ns0:p>
+    <ns0:p>
+      <ns0:pPr/>
+      <ns0:r>
         <ns0:t>Once a player in a finished local game is linked to an account on that Atlas, the game is added to their Atlas statistics automatically (Atlas 0.7.16 or later; older Atlases need every player linked). Players not linked yet count as guests, and get the game added when they're linked later. Other games can be matched to Atlas accounts by hand in History. A local game is never deleted by importing it.</ns0:t>
       </ns0:r>
     </ns0:p>
@@ -2654,7 +2660,7 @@
         <ns0:t>Manage people:</ns0:t>
       </ns0:r>
       <ns0:r>
-        <ns0:t xml:space="preserve"> roles, archive and restore accounts, image approval.</ns0:t>
+        <ns0:t xml:space="preserve"> roles, archive and restore accounts, image approval, and merging two accounts that belong to the same person (their statistics are added together, the other account is archived, and phones linked to it follow the account that is kept).</ns0:t>
       </ns0:r>
     </ns0:p>
     <ns0:p>

</xml_diff>

<commit_message>
Give app extras a More tab with separate settings pages
</commit_message>
<xml_diff>
--- a/Documentation/User Manual/TurnHub App Manual V0.21.docx
+++ b/Documentation/User Manual/TurnHub App Manual V0.21.docx
@@ -193,10 +193,10 @@
         <ns0:rPr>
           <ns0:b/>
         </ns0:rPr>
-        <ns0:t>Settings:</ns0:t>
-      </ns0:r>
-      <ns0:r>
-        <ns0:t xml:space="preserve"> appearance, sound, Commander card art, Atlas connection, and administration when you have permission on a connected Atlas.</ns0:t>
+        <ns0:t>More:</ns0:t>
+      </ns0:r>
+      <ns0:r>
+        <ns0:t xml:space="preserve"> About TurnHub, Settings and Store. Open More &gt; Settings for appearance, sound, Commander card art, Atlas connection, and administration when you have permission on a connected Atlas. The Store is not open yet. Settings mentioned in this manual are inside More.</ns0:t>
       </ns0:r>
     </ns0:p>
     <ns0:p>
@@ -226,7 +226,7 @@
         <ns0:t>?</ns0:t>
       </ns0:r>
       <ns0:r>
-        <ns0:t xml:space="preserve"> button opens this manual. Long-press either to see its name. The app version and build number are shown in the lobby, at the bottom of Settings and in the table menu; mention them when you report a problem.</ns0:t>
+        <ns0:t xml:space="preserve"> button opens this manual. Long-press either to see its name. The app version and build number are shown in the lobby, on More, at the bottom of Settings and in the table menu; mention them when you report a problem.</ns0:t>
       </ns0:r>
     </ns0:p>
     <ns0:p>

</xml_diff>

<commit_message>
Add optional home Wi-Fi to Atlas, with a table channel setting
Off by default. Atlas keeps its TurnHub-Atlas hotspot and joins a saved home
network between games to read the release feed itself; it stays on that
network when the router shares the table channel. The table channel (1-11,
default 6) is an advanced setting, and Sigils now search channels 1-11 for
Atlas when they lose it or get no answer while pairing.

Settings: a Home Wi-Fi row on the Atlas screen, and a Home Wi-Fi card with the
channel picker in the app and the portal. New routes /api/network/home,
/api/network/home/check and /api/network/channel; /api/network reports both.

Co-Authored-By: Claude Opus 5.5 <noreply@anthropic.com>
Claude-Session: https://claude.ai/code/session_014DUoHJexFMa8S6XHrGqtpG
</commit_message>
<xml_diff>
--- a/Documentation/User Manual/TurnHub App Manual V0.21.docx
+++ b/Documentation/User Manual/TurnHub App Manual V0.21.docx
@@ -2678,6 +2678,20 @@
       </ns0:r>
       <ns0:r>
         <ns0:t xml:space="preserve"> the table's own password, 8 to 63 characters. Saving restarts Atlas.</ns0:t>
+      </ns0:r>
+    </ns0:p>
+    <ns0:p>
+      <ns0:pPr>
+        <ns0:numPr>
+          <ns0:ilvl ns0:val="0"/>
+          <ns0:numId ns0:val="1"/>
+        </ns0:numPr>
+      </ns0:pPr>
+      <ns0:r>
+        <ns0:rPr>
+          <ns0:b/>
+        </ns0:rPr>
+        <ns0:t>Home Wi-Fi: optional and off by default. Save your home network's name and password, then turn on Use home Wi-Fi; Atlas checks for updates on it between games, and Check now asks for a check at once. Table channel (advanced) moves Atlas, its network and the Sigils to another channel, 1 to 11; choose your home network's channel so Atlas can stay connected to it. Saving the channel restarts Atlas.</ns0:t>
       </ns0:r>
     </ns0:p>
     <ns0:p>

</xml_diff>

<commit_message>
Unify connected game controls and reserve profile PINs for stats and administration
</commit_message>
<xml_diff>
--- a/Documentation/User Manual/TurnHub App Manual V0.21.docx
+++ b/Documentation/User Manual/TurnHub App Manual V0.21.docx
@@ -2404,34 +2404,34 @@
     <ns0:p>
       <ns0:pPr/>
       <ns0:r>
-        <ns0:t xml:space="preserve">One tablet or phone in the middle of the table can act for everyone at an Atlas game. Sign in, open </ns0:t>
-      </ns0:r>
-      <ns0:r>
-        <ns0:rPr>
-          <ns0:b/>
-        </ns0:rPr>
-        <ns0:t>Game</ns0:t>
-      </ns0:r>
-      <ns0:r>
-        <ns0:t xml:space="preserve"> and tap </ns0:t>
-      </ns0:r>
-      <ns0:r>
-        <ns0:rPr>
-          <ns0:b/>
-        </ns0:rPr>
-        <ns0:t>Open tablet mode</ns0:t>
-      </ns0:r>
-      <ns0:r>
-        <ns0:t xml:space="preserve">. The device switches to the Shared tablet account; your own phone can stay signed in. If the table code is on, tap </ns0:t>
-      </ns0:r>
-      <ns0:r>
-        <ns0:rPr>
-          <ns0:b/>
-        </ns0:rPr>
-        <ns0:t>Show a code on Atlas</ns0:t>
-      </ns0:r>
-      <ns0:r>
-        <ns0:t xml:space="preserve"> and type the six digits from the Atlas screen; an account with the Tablet access role skips this.</ns0:t>
+        <ns0:t xml:space="preserve">Any signed-in phone or tablet can control the shared Atlas game from Game or Table. Add profiles in the lobby and use the same game controls when play starts, including Pass. No tablet permission, enable step or table code is needed for gameplay. Your personal profile stays signed in.</ns0:t>
+      </ns0:r>
+      <ns0:r>
+        <ns0:rPr>
+          <ns0:b/>
+        </ns0:rPr>
+        <ns0:t/>
+      </ns0:r>
+      <ns0:r>
+        <ns0:t xml:space="preserve"/>
+      </ns0:r>
+      <ns0:r>
+        <ns0:rPr>
+          <ns0:b/>
+        </ns0:rPr>
+        <ns0:t/>
+      </ns0:r>
+      <ns0:r>
+        <ns0:t xml:space="preserve"/>
+      </ns0:r>
+      <ns0:r>
+        <ns0:rPr>
+          <ns0:b/>
+        </ns0:rPr>
+        <ns0:t/>
+      </ns0:r>
+      <ns0:r>
+        <ns0:t xml:space="preserve"/>
       </ns0:r>
     </ns0:p>
     <ns0:p>
@@ -2572,43 +2572,43 @@
     <ns0:p>
       <ns0:pPr/>
       <ns0:r>
-        <ns0:t xml:space="preserve">Accounts on an Atlas can be given roles by an Admin: </ns0:t>
-      </ns0:r>
-      <ns0:r>
-        <ns0:rPr>
-          <ns0:b/>
-        </ns0:rPr>
-        <ns0:t>Admin</ns0:t>
-      </ns0:r>
-      <ns0:r>
-        <ns0:t xml:space="preserve"> (administration), </ns0:t>
-      </ns0:r>
-      <ns0:r>
-        <ns0:rPr>
-          <ns0:b/>
-        </ns0:rPr>
-        <ns0:t>Game Master</ns0:t>
-      </ns0:r>
-      <ns0:r>
-        <ns0:t xml:space="preserve"> (fixes unusual game states at the table), </ns0:t>
-      </ns0:r>
-      <ns0:r>
-        <ns0:rPr>
-          <ns0:b/>
-        </ns0:rPr>
-        <ns0:t>Developer</ns0:t>
-      </ns0:r>
-      <ns0:r>
-        <ns0:t xml:space="preserve"> (diagnostics) and </ns0:t>
-      </ns0:r>
-      <ns0:r>
-        <ns0:rPr>
-          <ns0:b/>
-        </ns0:rPr>
-        <ns0:t>Tablet access</ns0:t>
-      </ns0:r>
-      <ns0:r>
-        <ns0:t xml:space="preserve"> (tablet mode without a code). Roles need a PIN or password. A Game Master's pass is recorded as a master pass, not as the player's own. When a Game Master resets a player's connections or removes them from a game, only that player can see it, on their own statistics.</ns0:t>
+        <ns0:t xml:space="preserve">An Admin can assign Admin, Game Master and Developer roles. Enter your profile PIN for private statistics or privileged administration. A profile can be chosen and used for gameplay without its PIN. Atlas continues validating every game action.</ns0:t>
+      </ns0:r>
+      <ns0:r>
+        <ns0:rPr>
+          <ns0:b/>
+        </ns0:rPr>
+        <ns0:t/>
+      </ns0:r>
+      <ns0:r>
+        <ns0:t xml:space="preserve"/>
+      </ns0:r>
+      <ns0:r>
+        <ns0:rPr>
+          <ns0:b/>
+        </ns0:rPr>
+        <ns0:t/>
+      </ns0:r>
+      <ns0:r>
+        <ns0:t xml:space="preserve"/>
+      </ns0:r>
+      <ns0:r>
+        <ns0:rPr>
+          <ns0:b/>
+        </ns0:rPr>
+        <ns0:t/>
+      </ns0:r>
+      <ns0:r>
+        <ns0:t xml:space="preserve"/>
+      </ns0:r>
+      <ns0:r>
+        <ns0:rPr>
+          <ns0:b/>
+        </ns0:rPr>
+        <ns0:t/>
+      </ns0:r>
+      <ns0:r>
+        <ns0:t xml:space="preserve"/>
       </ns0:r>
     </ns0:p>
     <ns0:p>
@@ -3029,7 +3029,7 @@
     <ns0:p>
       <ns0:pPr/>
       <ns0:r>
-        <ns0:t>The table code is on. An Admin can turn it off, or give the account the Tablet access role.</ns0:t>
+        <ns0:t>Profile PINs protect private statistics and administrative access. They are not required for adding profiles, joining a game or operating gameplay controls.</ns0:t>
       </ns0:r>
     </ns0:p>
     <ns0:p>

</xml_diff>

<commit_message>
Fix mobile game panels and add player display selection
</commit_message>
<xml_diff>
--- a/Documentation/User Manual/TurnHub App Manual V0.21.docx
+++ b/Documentation/User Manual/TurnHub App Manual V0.21.docx
@@ -1231,6 +1231,56 @@
       </ns0:r>
     </ns0:p>
     <ns0:p>
+      <ns0:r>
+        <ns0:t xml:space="preserve">On the </ns0:t>
+      </ns0:r>
+      <ns0:r>
+        <ns0:rPr>
+          <ns0:b/>
+        </ns0:rPr>
+        <ns0:t xml:space="preserve">Game</ns0:t>
+      </ns0:r>
+      <ns0:r>
+        <ns0:t xml:space="preserve"> tab, open </ns0:t>
+      </ns0:r>
+      <ns0:r>
+        <ns0:rPr>
+          <ns0:b/>
+        </ns0:rPr>
+        <ns0:t xml:space="preserve">Game card</ns0:t>
+      </ns0:r>
+      <ns0:r>
+        <ns0:t xml:space="preserve"> to show </ns0:t>
+      </ns0:r>
+      <ns0:r>
+        <ns0:rPr>
+          <ns0:b/>
+        </ns0:rPr>
+        <ns0:t xml:space="preserve">Only</ns0:t>
+      </ns0:r>
+      <ns0:r>
+        <ns0:t xml:space="preserve"> a chosen player or team, or use </ns0:t>
+      </ns0:r>
+      <ns0:r>
+        <ns0:rPr>
+          <ns0:b/>
+        </ns0:rPr>
+        <ns0:t xml:space="preserve">Pass and play</ns0:t>
+      </ns0:r>
+      <ns0:r>
+        <ns0:t xml:space="preserve"> to follow the turn among selected players. No selection includes everyone. This changes only what this device displays; it does not change turn order or player seats. A player needed to confirm a win remains available to answer. The </ns0:t>
+      </ns0:r>
+      <ns0:r>
+        <ns0:rPr>
+          <ns0:b/>
+        </ns0:rPr>
+        <ns0:t xml:space="preserve">Table</ns0:t>
+      </ns0:r>
+      <ns0:r>
+        <ns0:t xml:space="preserve"> tab retains its seating layout.</ns0:t>
+      </ns0:r>
+    </ns0:p>
+    <ns0:p>
       <ns0:pPr>
         <ns0:numPr>
           <ns0:ilvl ns0:val="0"/>
@@ -1311,13 +1361,22 @@
     <ns0:p>
       <ns0:pPr/>
       <ns0:r>
-        <ns0:t xml:space="preserve">The control in the middle of the table opens the game menu. </ns0:t>
-      </ns0:r>
-      <ns0:r>
-        <ns0:rPr>
-          <ns0:b/>
-        </ns0:rPr>
-        <ns0:t>Pause game</ns0:t>
+        <ns0:t xml:space="preserve">The control in the middle of the table opens the game menu. During the first three minutes, </ns0:t>
+      </ns0:r>
+      <ns0:r>
+        <ns0:rPr>
+          <ns0:b/>
+        </ns0:rPr>
+        <ns0:t xml:space="preserve">Back to setup</ns0:t>
+      </ns0:r>
+      <ns0:r>
+        <ns0:t xml:space="preserve"> appears first with its remaining time. It returns to setup with the same players and settings and saves nothing; tap again to confirm. </ns0:t>
+      </ns0:r>
+      <ns0:r>
+        <ns0:rPr>
+          <ns0:b/>
+        </ns0:rPr>
+        <ns0:t xml:space="preserve">Pause game</ns0:t>
       </ns0:r>
       <ns0:r>
         <ns0:t xml:space="preserve"> (or </ns0:t>
@@ -1326,10 +1385,10 @@
         <ns0:rPr>
           <ns0:b/>
         </ns0:rPr>
-        <ns0:t>Resume game</ns0:t>
-      </ns0:r>
-      <ns0:r>
-        <ns0:t>) stays at the top. It also holds:</ns0:t>
+        <ns0:t xml:space="preserve">Resume game</ns0:t>
+      </ns0:r>
+      <ns0:r>
+        <ns0:t xml:space="preserve">) is directly below the game clock. The menu also holds:</ns0:t>
       </ns0:r>
     </ns0:p>
     <ns0:p>
@@ -1464,7 +1523,7 @@
         <ns0:rPr>
           <ns0:b/>
         </ns0:rPr>
-        <ns0:t>Finish game:</ns0:t>
+        <ns0:t xml:space="preserve">Finish game:</ns0:t>
       </ns0:r>
       <ns0:r>
         <ns0:t xml:space="preserve"> </ns0:t>
@@ -1473,19 +1532,10 @@
         <ns0:rPr>
           <ns0:b/>
         </ns0:rPr>
-        <ns0:t>End without a winner</ns0:t>
-      </ns0:r>
-      <ns0:r>
-        <ns0:t xml:space="preserve"> (a draw) and, during the first three minutes, </ns0:t>
-      </ns0:r>
-      <ns0:r>
-        <ns0:rPr>
-          <ns0:b/>
-        </ns0:rPr>
-        <ns0:t>Back to setup</ns0:t>
-      </ns0:r>
-      <ns0:r>
-        <ns0:t>, which returns to Game with the same players and settings and saves nothing.</ns0:t>
+        <ns0:t xml:space="preserve">End without a winner</ns0:t>
+      </ns0:r>
+      <ns0:r>
+        <ns0:t xml:space="preserve"> (a draw).</ns0:t>
       </ns0:r>
     </ns0:p>
     <ns0:p>
@@ -1536,7 +1586,16 @@
         <ns0:rPr>
           <ns0:b/>
         </ns0:rPr>
-        <ns0:t>Commander tax:</ns0:t>
+        <ns0:t xml:space="preserve">Commander · tax &amp; damage</ns0:t>
+      </ns0:r>
+      <ns0:r>
+        <ns0:t xml:space="preserve"> groups your own commander tax and received damage, with separate labels. </ns0:t>
+      </ns0:r>
+      <ns0:r>
+        <ns0:rPr>
+          <ns0:b/>
+        </ns0:rPr>
+        <ns0:t xml:space="preserve">Commander tax · your casts:</ns0:t>
       </ns0:r>
       <ns0:r>
         <ns0:t xml:space="preserve"> count each commander's casts from the command zone. The next cast costs two more generic mana per earlier cast; minus corrects a mistake.</ns0:t>
@@ -1553,16 +1612,16 @@
         <ns0:rPr>
           <ns0:b/>
         </ns0:rPr>
-        <ns0:t>Commander damage:</ns0:t>
-      </ns0:r>
-      <ns0:r>
-        <ns0:t xml:space="preserve"> record damage this player received from each opponent's commander. Each hit also comes off their life, and a correction gives it back. Turn on </ns0:t>
-      </ns0:r>
-      <ns0:r>
-        <ns0:rPr>
-          <ns0:b/>
-        </ns0:rPr>
-        <ns0:t>Partner commanders</ns0:t>
+        <ns0:t xml:space="preserve">Commander damage received</ns0:t>
+      </ns0:r>
+      <ns0:r>
+        <ns0:t xml:space="preserve"> in the same card: record damage this player received from each opponent's commander. Each hit also comes off their life, and a correction gives it back. Turn on </ns0:t>
+      </ns0:r>
+      <ns0:r>
+        <ns0:rPr>
+          <ns0:b/>
+        </ns0:rPr>
+        <ns0:t xml:space="preserve">Partner commanders</ns0:t>
       </ns0:r>
       <ns0:r>
         <ns0:t xml:space="preserve"> for a second commander's casts and damage.</ns0:t>

</xml_diff>

<commit_message>
Simplify game setup and add reusable named game presets
</commit_message>
<xml_diff>
--- a/Documentation/User Manual/TurnHub App Manual V0.21.docx
+++ b/Documentation/User Manual/TurnHub App Manual V0.21.docx
@@ -193,10 +193,10 @@
         <ns0:rPr>
           <ns0:b/>
         </ns0:rPr>
-        <ns0:t>More:</ns0:t>
-      </ns0:r>
-      <ns0:r>
-        <ns0:t xml:space="preserve"> About TurnHub, Settings and Store. Open More &gt; Settings for appearance, sound, Commander card art, Atlas connection, and administration when you have permission on a connected Atlas. The Store is not open yet. Settings mentioned in this manual are inside More.</ns0:t>
+        <ns0:t xml:space="preserve">More:</ns0:t>
+      </ns0:r>
+      <ns0:r>
+        <ns0:t xml:space="preserve"> Settings, Atlas connection and administration, About TurnHub and optional support. Appearance and sound are in Settings. Hardware controls are in Atlas.</ns0:t>
       </ns0:r>
     </ns0:p>
     <ns0:p>
@@ -441,7 +441,25 @@
         </ns0:numPr>
       </ns0:pPr>
       <ns0:r>
-        <ns0:t>Add everyone who is playing: type a name, or pick a saved player.</ns0:t>
+        <ns0:t xml:space="preserve">Choose </ns0:t>
+      </ns0:r>
+      <ns0:r>
+        <ns0:rPr>
+          <ns0:b/>
+        </ns0:rPr>
+        <ns0:t xml:space="preserve">Commander</ns0:t>
+      </ns0:r>
+      <ns0:r>
+        <ns0:t xml:space="preserve"> (40 life) or </ns0:t>
+      </ns0:r>
+      <ns0:r>
+        <ns0:rPr>
+          <ns0:b/>
+        </ns0:rPr>
+        <ns0:t xml:space="preserve">Magic · 20 life</ns0:t>
+      </ns0:r>
+      <ns0:r>
+        <ns0:t xml:space="preserve">, or tap Change for another game.</ns0:t>
       </ns0:r>
     </ns0:p>
     <ns0:p>
@@ -452,16 +470,16 @@
         </ns0:numPr>
       </ns0:pPr>
       <ns0:r>
-        <ns0:t xml:space="preserve">Arrange the seats: drag a player onto another seat, or tap two seats to swap them. Seats run clockwise in number order. </ns0:t>
-      </ns0:r>
-      <ns0:r>
-        <ns0:rPr>
-          <ns0:b/>
-        </ns0:rPr>
-        <ns0:t>Clear all</ns0:t>
-      </ns0:r>
-      <ns0:r>
-        <ns0:t xml:space="preserve"> empties the lobby without deleting any accounts, history or settings.</ns0:t>
+        <ns0:t xml:space="preserve">Add everyone: type a guest name, or choose a saved player. Arrange seats by dragging a player onto another seat, or tapping two seats. </ns0:t>
+      </ns0:r>
+      <ns0:r>
+        <ns0:rPr>
+          <ns0:b/>
+        </ns0:rPr>
+        <ns0:t xml:space="preserve">Remove all</ns0:t>
+      </ns0:r>
+      <ns0:r>
+        <ns0:t xml:space="preserve"> asks before emptying setup; saved players and history are kept.</ns0:t>
       </ns0:r>
     </ns0:p>
     <ns0:p>
@@ -472,16 +490,16 @@
         </ns0:numPr>
       </ns0:pPr>
       <ns0:r>
-        <ns0:t xml:space="preserve">Optionally tap </ns0:t>
-      </ns0:r>
-      <ns0:r>
-        <ns0:rPr>
-          <ns0:b/>
-        </ns0:rPr>
-        <ns0:t>First?</ns0:t>
-      </ns0:r>
-      <ns0:r>
-        <ns0:t xml:space="preserve"> next to a player to choose who goes first; tap it again to clear it. Otherwise a random player starts.</ns0:t>
+        <ns0:t xml:space="preserve">For variants, house rules, timers, Planechase and guided setup, turn on </ns0:t>
+      </ns0:r>
+      <ns0:r>
+        <ns0:rPr>
+          <ns0:b/>
+        </ns0:rPr>
+        <ns0:t xml:space="preserve">Advanced settings</ns0:t>
+      </ns0:r>
+      <ns0:r>
+        <ns0:t xml:space="preserve">. Turning it off hides the options and keeps your choices. Current life, timer and Magic variant remain visible above the players.</ns0:t>
       </ns0:r>
     </ns0:p>
     <ns0:p>
@@ -492,7 +510,7 @@
         </ns0:numPr>
       </ns0:pPr>
       <ns0:r>
-        <ns0:t>Choose the game mode, starting life and turn timer.</ns0:t>
+        <ns0:t xml:space="preserve">Check the players and settings. Naming a commander and choosing artwork are optional.</ns0:t>
       </ns0:r>
     </ns0:p>
     <ns0:p>
@@ -509,10 +527,39 @@
         <ns0:rPr>
           <ns0:b/>
         </ns0:rPr>
-        <ns0:t>Start full-screen game</ns0:t>
-      </ns0:r>
-      <ns0:r>
-        <ns0:t>. A three-second countdown runs before the clocks start; Cancel or Back stops it.</ns0:t>
+        <ns0:t xml:space="preserve">Start game</ns0:t>
+      </ns0:r>
+      <ns0:r>
+        <ns0:t xml:space="preserve">, then choose who goes first or let TurnHub choose randomly. A three-second countdown runs before the clocks start; Cancel or Back stops it.</ns0:t>
+      </ns0:r>
+    </ns0:p>
+    <ns0:p>
+      <ns0:r>
+        <ns0:rPr>
+          <ns0:b/>
+        </ns0:rPr>
+        <ns0:t xml:space="preserve">Saved game setups</ns0:t>
+      </ns0:r>
+      <ns0:r>
+        <ns0:t xml:space="preserve"> on this device: add players and choose your settings, then open Saved game setups and tap </ns0:t>
+      </ns0:r>
+      <ns0:r>
+        <ns0:rPr>
+          <ns0:b/>
+        </ns0:rPr>
+        <ns0:t xml:space="preserve">Save current setup</ns0:t>
+      </ns0:r>
+      <ns0:r>
+        <ns0:t xml:space="preserve">. Give it a name, such as Friday Commander. </ns0:t>
+      </ns0:r>
+      <ns0:r>
+        <ns0:rPr>
+          <ns0:b/>
+        </ns0:rPr>
+        <ns0:t xml:space="preserve">Load</ns0:t>
+      </ns0:r>
+      <ns0:r>
+        <ns0:t xml:space="preserve"> restores seat order, player identities, commanders, game type, starting life, timer, rules and Planechase choices into setup. It asks before replacing your current setup. Scores, clocks and results are reset; history stays intact. Reusing a name asks before replacing the saved setup, and Delete removes only that preset. A deleted saved-player identity must be added again in a new setup. These presets are stored on this phone; applying them to an Atlas lobby is not available yet.</ns0:t>
       </ns0:r>
     </ns0:p>
     <ns0:p>

</xml_diff>

<commit_message>
Separate commander names from artwork and remember player choices
</commit_message>
<xml_diff>
--- a/Documentation/User Manual/TurnHub App Manual V0.21.docx
+++ b/Documentation/User Manual/TurnHub App Manual V0.21.docx
@@ -1179,25 +1179,7 @@
     <ns0:p>
       <ns0:pPr/>
       <ns0:r>
-        <ns0:t xml:space="preserve">In any Commander mode, </ns0:t>
-      </ns0:r>
-      <ns0:r>
-        <ns0:rPr>
-          <ns0:b/>
-        </ns0:rPr>
-        <ns0:t>Name commander</ns0:t>
-      </ns0:r>
-      <ns0:r>
-        <ns0:t xml:space="preserve"> next to a player lets them name their commander. The name shows under theirs, names their commander-tax counter and labels the Commander damage others take from it. As you type, matching card names are suggested from Scryfall; pick one, and choose a printing whose art fills the player's tile, credited to its artist. The original commander-card icon takes the printing's rarity color. Only what you type is sent to Scryfall. </ns0:t>
-      </ns0:r>
-      <ns0:r>
-        <ns0:rPr>
-          <ns0:b/>
-        </ns0:rPr>
-        <ns0:t>Commander card art</ns0:t>
-      </ns0:r>
-      <ns0:r>
-        <ns0:t xml:space="preserve"> in Settings turns the suggestions and art off.</ns0:t>
+        <ns0:t>In any Commander mode, Name commander lets a player type their commander name (up to 80 characters). Choose Use commander's art, No art, or Choose other art to search Magic, Pokémon, Lorcana or Yu-Gi-Oh! independently. Artwork never changes the named commander, tax or damage labels. Selecting a suggested card shows every available artwork, including a single printing. Saved players on this device remember their six most recent name/art combinations; Saved commanders reopens a choice for editing before Save. Atlas profiles store up to six choices on its microSD card. Guests can name a commander for the current phone-hosted game, but have no per-player saved commander list. Naming and artwork are optional. Player display names remain limited to 32 characters for readable controls.</ns0:t>
       </ns0:r>
     </ns0:p>
     <ns0:p>

</xml_diff>